<commit_message>
Organize course files by week and term
</commit_message>
<xml_diff>
--- a/PAPELEO GRADUACIÓN/FORMATO_DE_CONTROL_Y_SEGUIMIENTO_DE_DIRECTORES_DE[1][1].docx
+++ b/PAPELEO GRADUACIÓN/FORMATO_DE_CONTROL_Y_SEGUIMIENTO_DE_DIRECTORES_DE[1][1].docx
@@ -546,6 +546,87 @@
           <w:lang w:val="es-ES"/>
         </w:rPr>
       </w:pPr>
+      <w:r>
+        <w:rPr>
+          <w:noProof/>
+        </w:rPr>
+        <w:drawing>
+          <wp:anchor distT="0" distB="0" distL="114300" distR="114300" simplePos="0" relativeHeight="251665408" behindDoc="0" locked="0" layoutInCell="1" allowOverlap="1" wp14:anchorId="5AEF06C0" wp14:editId="668AD3E3">
+            <wp:simplePos x="0" y="0"/>
+            <wp:positionH relativeFrom="column">
+              <wp:posOffset>3638208</wp:posOffset>
+            </wp:positionH>
+            <wp:positionV relativeFrom="paragraph">
+              <wp:posOffset>59592</wp:posOffset>
+            </wp:positionV>
+            <wp:extent cx="1230923" cy="844014"/>
+            <wp:effectExtent l="0" t="0" r="7620" b="0"/>
+            <wp:wrapNone/>
+            <wp:docPr id="549262804" name="Imagen 1"/>
+            <wp:cNvGraphicFramePr>
+              <a:graphicFrameLocks xmlns:a="http://schemas.openxmlformats.org/drawingml/2006/main" noChangeAspect="1"/>
+            </wp:cNvGraphicFramePr>
+            <a:graphic xmlns:a="http://schemas.openxmlformats.org/drawingml/2006/main">
+              <a:graphicData uri="http://schemas.openxmlformats.org/drawingml/2006/picture">
+                <pic:pic xmlns:pic="http://schemas.openxmlformats.org/drawingml/2006/picture">
+                  <pic:nvPicPr>
+                    <pic:cNvPr id="0" name="Picture 1"/>
+                    <pic:cNvPicPr>
+                      <a:picLocks noChangeAspect="1" noChangeArrowheads="1"/>
+                    </pic:cNvPicPr>
+                  </pic:nvPicPr>
+                  <pic:blipFill rotWithShape="1">
+                    <a:blip r:embed="rId4">
+                      <a:extLst>
+                        <a:ext uri="{BEBA8EAE-BF5A-486C-A8C5-ECC9F3942E4B}">
+                          <a14:imgProps xmlns:a14="http://schemas.microsoft.com/office/drawing/2010/main">
+                            <a14:imgLayer r:embed="rId5">
+                              <a14:imgEffect>
+                                <a14:brightnessContrast bright="40000" contrast="40000"/>
+                              </a14:imgEffect>
+                            </a14:imgLayer>
+                          </a14:imgProps>
+                        </a:ext>
+                        <a:ext uri="{28A0092B-C50C-407E-A947-70E740481C1C}">
+                          <a14:useLocalDpi xmlns:a14="http://schemas.microsoft.com/office/drawing/2010/main" val="0"/>
+                        </a:ext>
+                      </a:extLst>
+                    </a:blip>
+                    <a:srcRect l="24926" t="42054" r="26538" b="42979"/>
+                    <a:stretch>
+                      <a:fillRect/>
+                    </a:stretch>
+                  </pic:blipFill>
+                  <pic:spPr bwMode="auto">
+                    <a:xfrm>
+                      <a:off x="0" y="0"/>
+                      <a:ext cx="1230923" cy="844014"/>
+                    </a:xfrm>
+                    <a:prstGeom prst="rect">
+                      <a:avLst/>
+                    </a:prstGeom>
+                    <a:noFill/>
+                    <a:ln>
+                      <a:noFill/>
+                    </a:ln>
+                    <a:extLst>
+                      <a:ext uri="{53640926-AAD7-44D8-BBD7-CCE9431645EC}">
+                        <a14:shadowObscured xmlns:a14="http://schemas.microsoft.com/office/drawing/2010/main"/>
+                      </a:ext>
+                    </a:extLst>
+                  </pic:spPr>
+                </pic:pic>
+              </a:graphicData>
+            </a:graphic>
+            <wp14:sizeRelH relativeFrom="margin">
+              <wp14:pctWidth>0</wp14:pctWidth>
+            </wp14:sizeRelH>
+            <wp14:sizeRelV relativeFrom="margin">
+              <wp14:pctHeight>0</wp14:pctHeight>
+            </wp14:sizeRelV>
+          </wp:anchor>
+        </w:drawing>
+      </w:r>
       <w:r>
         <w:rPr>
           <w:rFonts w:ascii="Times New Roman" w:hAnsi="Times New Roman" w:cs="Times New Roman"/>
@@ -576,7 +657,7 @@
                     <pic:cNvPicPr/>
                   </pic:nvPicPr>
                   <pic:blipFill>
-                    <a:blip r:embed="rId4" cstate="print">
+                    <a:blip r:embed="rId6" cstate="print">
                       <a:extLst>
                         <a:ext uri="{28A0092B-C50C-407E-A947-70E740481C1C}">
                           <a14:useLocalDpi xmlns:a14="http://schemas.microsoft.com/office/drawing/2010/main" val="0"/>
@@ -1241,6 +1322,87 @@
       </w:pPr>
       <w:r>
         <w:rPr>
+          <w:noProof/>
+        </w:rPr>
+        <w:drawing>
+          <wp:anchor distT="0" distB="0" distL="114300" distR="114300" simplePos="0" relativeHeight="251667456" behindDoc="0" locked="0" layoutInCell="1" allowOverlap="1" wp14:anchorId="5F8813B8" wp14:editId="1DF1D0C8">
+            <wp:simplePos x="0" y="0"/>
+            <wp:positionH relativeFrom="column">
+              <wp:posOffset>3598985</wp:posOffset>
+            </wp:positionH>
+            <wp:positionV relativeFrom="paragraph">
+              <wp:posOffset>16950</wp:posOffset>
+            </wp:positionV>
+            <wp:extent cx="1230923" cy="844014"/>
+            <wp:effectExtent l="0" t="0" r="7620" b="0"/>
+            <wp:wrapNone/>
+            <wp:docPr id="427306741" name="Imagen 1"/>
+            <wp:cNvGraphicFramePr>
+              <a:graphicFrameLocks xmlns:a="http://schemas.openxmlformats.org/drawingml/2006/main" noChangeAspect="1"/>
+            </wp:cNvGraphicFramePr>
+            <a:graphic xmlns:a="http://schemas.openxmlformats.org/drawingml/2006/main">
+              <a:graphicData uri="http://schemas.openxmlformats.org/drawingml/2006/picture">
+                <pic:pic xmlns:pic="http://schemas.openxmlformats.org/drawingml/2006/picture">
+                  <pic:nvPicPr>
+                    <pic:cNvPr id="0" name="Picture 1"/>
+                    <pic:cNvPicPr>
+                      <a:picLocks noChangeAspect="1" noChangeArrowheads="1"/>
+                    </pic:cNvPicPr>
+                  </pic:nvPicPr>
+                  <pic:blipFill rotWithShape="1">
+                    <a:blip r:embed="rId4">
+                      <a:extLst>
+                        <a:ext uri="{BEBA8EAE-BF5A-486C-A8C5-ECC9F3942E4B}">
+                          <a14:imgProps xmlns:a14="http://schemas.microsoft.com/office/drawing/2010/main">
+                            <a14:imgLayer r:embed="rId5">
+                              <a14:imgEffect>
+                                <a14:brightnessContrast bright="40000" contrast="40000"/>
+                              </a14:imgEffect>
+                            </a14:imgLayer>
+                          </a14:imgProps>
+                        </a:ext>
+                        <a:ext uri="{28A0092B-C50C-407E-A947-70E740481C1C}">
+                          <a14:useLocalDpi xmlns:a14="http://schemas.microsoft.com/office/drawing/2010/main" val="0"/>
+                        </a:ext>
+                      </a:extLst>
+                    </a:blip>
+                    <a:srcRect l="24926" t="42054" r="26538" b="42979"/>
+                    <a:stretch>
+                      <a:fillRect/>
+                    </a:stretch>
+                  </pic:blipFill>
+                  <pic:spPr bwMode="auto">
+                    <a:xfrm>
+                      <a:off x="0" y="0"/>
+                      <a:ext cx="1230923" cy="844014"/>
+                    </a:xfrm>
+                    <a:prstGeom prst="rect">
+                      <a:avLst/>
+                    </a:prstGeom>
+                    <a:noFill/>
+                    <a:ln>
+                      <a:noFill/>
+                    </a:ln>
+                    <a:extLst>
+                      <a:ext uri="{53640926-AAD7-44D8-BBD7-CCE9431645EC}">
+                        <a14:shadowObscured xmlns:a14="http://schemas.microsoft.com/office/drawing/2010/main"/>
+                      </a:ext>
+                    </a:extLst>
+                  </pic:spPr>
+                </pic:pic>
+              </a:graphicData>
+            </a:graphic>
+            <wp14:sizeRelH relativeFrom="margin">
+              <wp14:pctWidth>0</wp14:pctWidth>
+            </wp14:sizeRelH>
+            <wp14:sizeRelV relativeFrom="margin">
+              <wp14:pctHeight>0</wp14:pctHeight>
+            </wp14:sizeRelV>
+          </wp:anchor>
+        </w:drawing>
+      </w:r>
+      <w:r>
+        <w:rPr>
           <w:rFonts w:ascii="Times New Roman" w:hAnsi="Times New Roman" w:cs="Times New Roman"/>
           <w:noProof/>
           <w:lang w:val="es-ES"/>
@@ -1269,7 +1431,7 @@
                     <pic:cNvPicPr/>
                   </pic:nvPicPr>
                   <pic:blipFill>
-                    <a:blip r:embed="rId4" cstate="print">
+                    <a:blip r:embed="rId6" cstate="print">
                       <a:extLst>
                         <a:ext uri="{28A0092B-C50C-407E-A947-70E740481C1C}">
                           <a14:useLocalDpi xmlns:a14="http://schemas.microsoft.com/office/drawing/2010/main" val="0"/>
@@ -1920,6 +2082,87 @@
       </w:pPr>
       <w:r>
         <w:rPr>
+          <w:noProof/>
+        </w:rPr>
+        <w:drawing>
+          <wp:anchor distT="0" distB="0" distL="114300" distR="114300" simplePos="0" relativeHeight="251669504" behindDoc="0" locked="0" layoutInCell="1" allowOverlap="1" wp14:anchorId="10E60E5E" wp14:editId="2B38D494">
+            <wp:simplePos x="0" y="0"/>
+            <wp:positionH relativeFrom="column">
+              <wp:posOffset>3581400</wp:posOffset>
+            </wp:positionH>
+            <wp:positionV relativeFrom="paragraph">
+              <wp:posOffset>28673</wp:posOffset>
+            </wp:positionV>
+            <wp:extent cx="1230923" cy="844014"/>
+            <wp:effectExtent l="0" t="0" r="7620" b="0"/>
+            <wp:wrapNone/>
+            <wp:docPr id="184189390" name="Imagen 1"/>
+            <wp:cNvGraphicFramePr>
+              <a:graphicFrameLocks xmlns:a="http://schemas.openxmlformats.org/drawingml/2006/main" noChangeAspect="1"/>
+            </wp:cNvGraphicFramePr>
+            <a:graphic xmlns:a="http://schemas.openxmlformats.org/drawingml/2006/main">
+              <a:graphicData uri="http://schemas.openxmlformats.org/drawingml/2006/picture">
+                <pic:pic xmlns:pic="http://schemas.openxmlformats.org/drawingml/2006/picture">
+                  <pic:nvPicPr>
+                    <pic:cNvPr id="0" name="Picture 1"/>
+                    <pic:cNvPicPr>
+                      <a:picLocks noChangeAspect="1" noChangeArrowheads="1"/>
+                    </pic:cNvPicPr>
+                  </pic:nvPicPr>
+                  <pic:blipFill rotWithShape="1">
+                    <a:blip r:embed="rId4">
+                      <a:extLst>
+                        <a:ext uri="{BEBA8EAE-BF5A-486C-A8C5-ECC9F3942E4B}">
+                          <a14:imgProps xmlns:a14="http://schemas.microsoft.com/office/drawing/2010/main">
+                            <a14:imgLayer r:embed="rId5">
+                              <a14:imgEffect>
+                                <a14:brightnessContrast bright="40000" contrast="40000"/>
+                              </a14:imgEffect>
+                            </a14:imgLayer>
+                          </a14:imgProps>
+                        </a:ext>
+                        <a:ext uri="{28A0092B-C50C-407E-A947-70E740481C1C}">
+                          <a14:useLocalDpi xmlns:a14="http://schemas.microsoft.com/office/drawing/2010/main" val="0"/>
+                        </a:ext>
+                      </a:extLst>
+                    </a:blip>
+                    <a:srcRect l="24926" t="42054" r="26538" b="42979"/>
+                    <a:stretch>
+                      <a:fillRect/>
+                    </a:stretch>
+                  </pic:blipFill>
+                  <pic:spPr bwMode="auto">
+                    <a:xfrm>
+                      <a:off x="0" y="0"/>
+                      <a:ext cx="1230923" cy="844014"/>
+                    </a:xfrm>
+                    <a:prstGeom prst="rect">
+                      <a:avLst/>
+                    </a:prstGeom>
+                    <a:noFill/>
+                    <a:ln>
+                      <a:noFill/>
+                    </a:ln>
+                    <a:extLst>
+                      <a:ext uri="{53640926-AAD7-44D8-BBD7-CCE9431645EC}">
+                        <a14:shadowObscured xmlns:a14="http://schemas.microsoft.com/office/drawing/2010/main"/>
+                      </a:ext>
+                    </a:extLst>
+                  </pic:spPr>
+                </pic:pic>
+              </a:graphicData>
+            </a:graphic>
+            <wp14:sizeRelH relativeFrom="margin">
+              <wp14:pctWidth>0</wp14:pctWidth>
+            </wp14:sizeRelH>
+            <wp14:sizeRelV relativeFrom="margin">
+              <wp14:pctHeight>0</wp14:pctHeight>
+            </wp14:sizeRelV>
+          </wp:anchor>
+        </w:drawing>
+      </w:r>
+      <w:r>
+        <w:rPr>
           <w:rFonts w:ascii="Times New Roman" w:hAnsi="Times New Roman" w:cs="Times New Roman"/>
           <w:noProof/>
           <w:lang w:val="es-ES"/>
@@ -1948,7 +2191,7 @@
                     <pic:cNvPicPr/>
                   </pic:nvPicPr>
                   <pic:blipFill>
-                    <a:blip r:embed="rId4" cstate="print">
+                    <a:blip r:embed="rId6" cstate="print">
                       <a:extLst>
                         <a:ext uri="{28A0092B-C50C-407E-A947-70E740481C1C}">
                           <a14:useLocalDpi xmlns:a14="http://schemas.microsoft.com/office/drawing/2010/main" val="0"/>
@@ -2613,6 +2856,87 @@
       </w:pPr>
       <w:r>
         <w:rPr>
+          <w:noProof/>
+        </w:rPr>
+        <w:drawing>
+          <wp:anchor distT="0" distB="0" distL="114300" distR="114300" simplePos="0" relativeHeight="251671552" behindDoc="0" locked="0" layoutInCell="1" allowOverlap="1" wp14:anchorId="4973EA92" wp14:editId="297FECC3">
+            <wp:simplePos x="0" y="0"/>
+            <wp:positionH relativeFrom="column">
+              <wp:posOffset>3557953</wp:posOffset>
+            </wp:positionH>
+            <wp:positionV relativeFrom="paragraph">
+              <wp:posOffset>35169</wp:posOffset>
+            </wp:positionV>
+            <wp:extent cx="1230923" cy="844014"/>
+            <wp:effectExtent l="0" t="0" r="7620" b="0"/>
+            <wp:wrapNone/>
+            <wp:docPr id="1094961022" name="Imagen 1"/>
+            <wp:cNvGraphicFramePr>
+              <a:graphicFrameLocks xmlns:a="http://schemas.openxmlformats.org/drawingml/2006/main" noChangeAspect="1"/>
+            </wp:cNvGraphicFramePr>
+            <a:graphic xmlns:a="http://schemas.openxmlformats.org/drawingml/2006/main">
+              <a:graphicData uri="http://schemas.openxmlformats.org/drawingml/2006/picture">
+                <pic:pic xmlns:pic="http://schemas.openxmlformats.org/drawingml/2006/picture">
+                  <pic:nvPicPr>
+                    <pic:cNvPr id="0" name="Picture 1"/>
+                    <pic:cNvPicPr>
+                      <a:picLocks noChangeAspect="1" noChangeArrowheads="1"/>
+                    </pic:cNvPicPr>
+                  </pic:nvPicPr>
+                  <pic:blipFill rotWithShape="1">
+                    <a:blip r:embed="rId4">
+                      <a:extLst>
+                        <a:ext uri="{BEBA8EAE-BF5A-486C-A8C5-ECC9F3942E4B}">
+                          <a14:imgProps xmlns:a14="http://schemas.microsoft.com/office/drawing/2010/main">
+                            <a14:imgLayer r:embed="rId5">
+                              <a14:imgEffect>
+                                <a14:brightnessContrast bright="40000" contrast="40000"/>
+                              </a14:imgEffect>
+                            </a14:imgLayer>
+                          </a14:imgProps>
+                        </a:ext>
+                        <a:ext uri="{28A0092B-C50C-407E-A947-70E740481C1C}">
+                          <a14:useLocalDpi xmlns:a14="http://schemas.microsoft.com/office/drawing/2010/main" val="0"/>
+                        </a:ext>
+                      </a:extLst>
+                    </a:blip>
+                    <a:srcRect l="24926" t="42054" r="26538" b="42979"/>
+                    <a:stretch>
+                      <a:fillRect/>
+                    </a:stretch>
+                  </pic:blipFill>
+                  <pic:spPr bwMode="auto">
+                    <a:xfrm>
+                      <a:off x="0" y="0"/>
+                      <a:ext cx="1230923" cy="844014"/>
+                    </a:xfrm>
+                    <a:prstGeom prst="rect">
+                      <a:avLst/>
+                    </a:prstGeom>
+                    <a:noFill/>
+                    <a:ln>
+                      <a:noFill/>
+                    </a:ln>
+                    <a:extLst>
+                      <a:ext uri="{53640926-AAD7-44D8-BBD7-CCE9431645EC}">
+                        <a14:shadowObscured xmlns:a14="http://schemas.microsoft.com/office/drawing/2010/main"/>
+                      </a:ext>
+                    </a:extLst>
+                  </pic:spPr>
+                </pic:pic>
+              </a:graphicData>
+            </a:graphic>
+            <wp14:sizeRelH relativeFrom="margin">
+              <wp14:pctWidth>0</wp14:pctWidth>
+            </wp14:sizeRelH>
+            <wp14:sizeRelV relativeFrom="margin">
+              <wp14:pctHeight>0</wp14:pctHeight>
+            </wp14:sizeRelV>
+          </wp:anchor>
+        </w:drawing>
+      </w:r>
+      <w:r>
+        <w:rPr>
           <w:rFonts w:ascii="Times New Roman" w:hAnsi="Times New Roman" w:cs="Times New Roman"/>
           <w:noProof/>
           <w:lang w:val="es-ES"/>
@@ -2641,7 +2965,7 @@
                     <pic:cNvPicPr/>
                   </pic:nvPicPr>
                   <pic:blipFill>
-                    <a:blip r:embed="rId4" cstate="print">
+                    <a:blip r:embed="rId6" cstate="print">
                       <a:extLst>
                         <a:ext uri="{28A0092B-C50C-407E-A947-70E740481C1C}">
                           <a14:useLocalDpi xmlns:a14="http://schemas.microsoft.com/office/drawing/2010/main" val="0"/>

</xml_diff>